<commit_message>
virgen de las lajas
virgen de las lajas
</commit_message>
<xml_diff>
--- a/Historia escrita por Juan Carlos Reyes Guerrero_sinformato.docx
+++ b/Historia escrita por Juan Carlos Reyes Guerrero_sinformato.docx
@@ -1885,7 +1885,7 @@
               </wp:anchor>
             </w:drawing>
           </mc:Choice>
-          <mc:Fallback xmlns:wp14="http://schemas.microsoft.com/office/word/2010/wordml" xmlns:a="http://schemas.openxmlformats.org/drawingml/2006/main">
+          <mc:Fallback xmlns:a="http://schemas.openxmlformats.org/drawingml/2006/main" xmlns:wp14="http://schemas.microsoft.com/office/word/2010/wordml">
             <w:pict w14:anchorId="75345867">
               <v:rect id="Rectángulo 44" style="position:absolute;margin-left:0;margin-top:-25.9pt;width:99.65pt;height:12.65pt;z-index:251689984;visibility:visible;mso-wrap-style:square;mso-wrap-distance-left:9pt;mso-wrap-distance-top:0;mso-wrap-distance-right:9pt;mso-wrap-distance-bottom:0;mso-position-horizontal:left;mso-position-horizontal-relative:margin;mso-position-vertical:absolute;mso-position-vertical-relative:text;v-text-anchor:middle" o:spid="_x0000_s1026" fillcolor="white [3212]" stroked="f" strokeweight="1pt" w14:anchorId="15DBEFE4" o:gfxdata="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">
                 <w10:wrap anchorx="margin"/>
@@ -18494,6 +18494,27 @@
           <w:lang w:val="es-ES"/>
         </w:rPr>
         <w:t>Har un capitulo de las moliendas, cuando el abuelo molía la caña</w:t>
+      </w:r>
+    </w:p>
+    <w:p>
+      <w:pPr>
+        <w:spacing w:line="360" w:lineRule="auto"/>
+        <w:jc w:val="both"/>
+        <w:rPr>
+          <w:rFonts w:ascii="Aptos Serif" w:eastAsia="Bookman Old Style,Times New Rom" w:hAnsi="Aptos Serif" w:cs="Aptos Serif"/>
+          <w:sz w:val="24"/>
+          <w:szCs w:val="24"/>
+          <w:lang w:val="es-ES"/>
+        </w:rPr>
+      </w:pPr>
+      <w:r>
+        <w:rPr>
+          <w:rFonts w:ascii="Aptos Serif" w:eastAsia="Bookman Old Style,Times New Rom" w:hAnsi="Aptos Serif" w:cs="Aptos Serif"/>
+          <w:sz w:val="24"/>
+          <w:szCs w:val="24"/>
+          <w:lang w:val="es-ES"/>
+        </w:rPr>
+        <w:t>Las cosechas de maiz del alto, las moras de castilla, los motilones, los piojos, los moquillos</w:t>
       </w:r>
     </w:p>
     <w:p>

</xml_diff>